<commit_message>
busca por nome do animal ou do protetor e casos de teste automatizados
</commit_message>
<xml_diff>
--- a/docs/requisitos/especificacao-de-requisitos-adota-aqui.docx
+++ b/docs/requisitos/especificacao-de-requisitos-adota-aqui.docx
@@ -3333,7 +3333,7 @@
                 <w:szCs w:val="22"/>
                 <w:rtl w:val="0"/>
               </w:rPr>
-              <w:t xml:space="preserve">O sistema deve permitir a visualização da listagem de animais disponíveis, com filtros por espécie, raça, porte, sexo, atributos de convivência e cidade. O filtro de localização (mesmo estado) é fixo, herdado automaticamente da conta do Usuario. Para o Visitante e para o Abrigo autenticado, a listagem exibe animais de todos os estados. Se não houver nenhum animal disponível no estado do Usuario, o sistema deve exibir uma mensagem informativa. Cada animal listado deve exibir o nome do Protetor responsável pelo cadastro.</w:t>
+              <w:t xml:space="preserve">O sistema deve permitir a visualização da listagem de animais disponíveis, com filtros por espécie, raça, porte, sexo, atributos de convivência, nome do animal ou protetor, e cidade. O filtro de localização (mesmo estado) é fixo, herdado automaticamente da conta do Usuario. Para o Visitante e para o Abrigo autenticado, a listagem exibe animais de todos os estados. Se não houver nenhum animal disponível no estado do Usuario, o sistema deve exibir uma mensagem informativa. Cada animal listado deve exibir o nome do Protetor responsável pelo cadastro.</w:t>
             </w:r>
             <w:r>
               <w:rPr>
@@ -8273,6 +8273,20 @@
   <w:style w:type="paragraph" w:styleId="Normal" w:default="1">
     <w:name w:val="normal"/>
   </w:style>
+  <w:style w:type="table" w:styleId="TableNormal" w:default="1">
+    <w:name w:val="TableNormal"/>
+    <w:tblPr>
+      <w:tblCellMar>
+        <w:top w:w="100.0" w:type="dxa"/>
+        <w:left w:w="100.0" w:type="dxa"/>
+        <w:bottom w:w="100.0" w:type="dxa"/>
+        <w:right w:w="100.0" w:type="dxa"/>
+      </w:tblCellMar>
+    </w:tblPr>
+  </w:style>
+  <w:style w:type="paragraph" w:styleId="Normal" w:default="1">
+    <w:name w:val="normal"/>
+  </w:style>
   <w:style w:type="paragraph" w:styleId="Strong">
     <w:name w:val="Strong"/>
     <w:basedOn w:val="Normal"/>
@@ -8371,6 +8385,71 @@
       <w:sz w:val="20"/>
       <w:szCs w:val="20"/>
     </w:rPr>
+  </w:style>
+  <w:style w:type="table" w:styleId="Table1">
+    <w:basedOn w:val="TableNormal"/>
+    <w:tblPr>
+      <w:tblStyleRowBandSize w:val="1"/>
+      <w:tblStyleColBandSize w:val="1"/>
+      <w:tblCellMar>
+        <w:top w:w="0.0" w:type="dxa"/>
+        <w:left w:w="115.0" w:type="dxa"/>
+        <w:bottom w:w="0.0" w:type="dxa"/>
+        <w:right w:w="115.0" w:type="dxa"/>
+      </w:tblCellMar>
+    </w:tblPr>
+  </w:style>
+  <w:style w:type="table" w:styleId="Table2">
+    <w:basedOn w:val="TableNormal"/>
+    <w:tblPr>
+      <w:tblStyleRowBandSize w:val="1"/>
+      <w:tblStyleColBandSize w:val="1"/>
+      <w:tblCellMar>
+        <w:top w:w="0.0" w:type="dxa"/>
+        <w:left w:w="115.0" w:type="dxa"/>
+        <w:bottom w:w="0.0" w:type="dxa"/>
+        <w:right w:w="115.0" w:type="dxa"/>
+      </w:tblCellMar>
+    </w:tblPr>
+  </w:style>
+  <w:style w:type="table" w:styleId="Table3">
+    <w:basedOn w:val="TableNormal"/>
+    <w:tblPr>
+      <w:tblStyleRowBandSize w:val="1"/>
+      <w:tblStyleColBandSize w:val="1"/>
+      <w:tblCellMar>
+        <w:top w:w="0.0" w:type="dxa"/>
+        <w:left w:w="115.0" w:type="dxa"/>
+        <w:bottom w:w="0.0" w:type="dxa"/>
+        <w:right w:w="115.0" w:type="dxa"/>
+      </w:tblCellMar>
+    </w:tblPr>
+  </w:style>
+  <w:style w:type="table" w:styleId="Table4">
+    <w:basedOn w:val="TableNormal"/>
+    <w:tblPr>
+      <w:tblStyleRowBandSize w:val="1"/>
+      <w:tblStyleColBandSize w:val="1"/>
+      <w:tblCellMar>
+        <w:top w:w="0.0" w:type="dxa"/>
+        <w:left w:w="115.0" w:type="dxa"/>
+        <w:bottom w:w="0.0" w:type="dxa"/>
+        <w:right w:w="115.0" w:type="dxa"/>
+      </w:tblCellMar>
+    </w:tblPr>
+  </w:style>
+  <w:style w:type="table" w:styleId="Table5">
+    <w:basedOn w:val="TableNormal"/>
+    <w:tblPr>
+      <w:tblStyleRowBandSize w:val="1"/>
+      <w:tblStyleColBandSize w:val="1"/>
+      <w:tblCellMar>
+        <w:top w:w="0.0" w:type="dxa"/>
+        <w:left w:w="115.0" w:type="dxa"/>
+        <w:bottom w:w="0.0" w:type="dxa"/>
+        <w:right w:w="115.0" w:type="dxa"/>
+      </w:tblCellMar>
+    </w:tblPr>
   </w:style>
   <w:style w:type="table" w:styleId="Table1">
     <w:basedOn w:val="TableNormal"/>
@@ -8976,7 +9055,7 @@
 
 <file path=customXML/item1.xml><?xml version="1.0" encoding="utf-8"?>
 <go:gDocsCustomXmlDataStorage xmlns:go="http://customooxmlschemas.google.com/" xmlns:r="http://schemas.openxmlformats.org/officeDocument/2006/relationships" uri="GoogleDocsCustomDataVersion2">
-  <go:docsCustomData xmlns:go="http://customooxmlschemas.google.com/" roundtripDataSignature="AMtx7mhP4kbX5y4o/NRznYfkv/gtDVWDHw==">CgMxLjA4AHIhMTRXMHRiY29HbmNGTWh3R0RtWkk3NkI5TmhUWVg4aTd1</go:docsCustomData>
+  <go:docsCustomData xmlns:go="http://customooxmlschemas.google.com/" roundtripDataSignature="AMtx7mjJMlTn/yvrva8kt1XDHxuGzNUUqw==">CgMxLjA4AHIhMUNqb2E3TGc3Y1NkOFB0RUlsRzNVMkFRbVQ0cm1KVU56</go:docsCustomData>
 </go:gDocsCustomXmlDataStorage>
 </file>
 

</xml_diff>